<commit_message>
Rebuild the package on the corrected abstract
The abstract no longer leads with the temporal-resolution argument, which is a premise of
the design rather than a finding. It now reports what the models show: two of three
mechanisms held, shading failed backwards, and the wind effect exists only in its
interaction with stand density.

Removed an unsupported contrast with the fire refugia literature. It claimed fire refugia
are predicted by terrain without an interaction term. Both Krawchuk fire papers model
terrain conditional on weather, so the claim was wrong and the parallel is closer than it
asserted, not more distant. It was written from memory about papers that were never opened.

Also corrected: the wind main effect was described as absent. It is +0.022, small and
positive, meaning windier ground carried slightly more attack, and the abstract now says so.

Abstract 260 words of 300; body 5,932 of 6,000.

Claude-Session: https://claude.ai/code/session_01ByX1CSLBvHtdrVmiD2TTU2
</commit_message>
<xml_diff>
--- a/01.manuscript/submission-jae/cover-letter.docx
+++ b/01.manuscript/submission-jae/cover-letter.docx
@@ -209,25 +209,13 @@
         <w:t xml:space="preserve"> </w:t>
       </w:r>
       <w:r>
-        <w:t xml:space="preserve">conjunction: a thin stand and wind, in the same weeks the insect flies. This matters</w:t>
+        <w:t xml:space="preserve">conjunction: a thin stand and wind, in the same weeks the insect flies. A manager mapping exposed ground will</w:t>
       </w:r>
       <w:r>
         <w:t xml:space="preserve"> </w:t>
       </w:r>
       <w:r>
-        <w:t xml:space="preserve">because the disturbance refugia framework was built on wildfire, where refugia can be</w:t>
-      </w:r>
-      <w:r>
-        <w:t xml:space="preserve"> </w:t>
-      </w:r>
-      <w:r>
-        <w:t xml:space="preserve">mapped from terrain alone, and the transfer to beetle does not hold. A manager mapping</w:t>
-      </w:r>
-      <w:r>
-        <w:t xml:space="preserve"> </w:t>
-      </w:r>
-      <w:r>
-        <w:t xml:space="preserve">exposed ground will find nothing, and so will one mapping thin stands.</w:t>
+        <w:t xml:space="preserve">find nothing, and so will one mapping thin stands.</w:t>
       </w:r>
     </w:p>
     <w:p>

</xml_diff>